<commit_message>
Logs actualizados a su ultima version
</commit_message>
<xml_diff>
--- a/Logs de cada Rama.docx
+++ b/Logs de cada Rama.docx
@@ -26,49 +26,72 @@
     </w:p>
     <w:p>
       <w:pPr>
-        <w:rPr>
-          <w:b/>
-          <w:bCs/>
-          <w:sz w:val="24"/>
-          <w:szCs w:val="24"/>
-          <w:lang w:val="es-AR"/>
-        </w:rPr>
-      </w:pPr>
-      <w:r>
-        <w:rPr>
-          <w:b/>
-          <w:bCs/>
-          <w:sz w:val="24"/>
-          <w:szCs w:val="24"/>
-          <w:lang w:val="es-AR"/>
-        </w:rPr>
-        <w:t>Alumno: Cerino Gonzalo</w:t>
-      </w:r>
-    </w:p>
-    <w:p>
-      <w:pPr>
-        <w:jc w:val="center"/>
-        <w:rPr>
-          <w:b/>
-          <w:bCs/>
-          <w:sz w:val="40"/>
-          <w:szCs w:val="40"/>
-          <w:lang w:val="es-AR"/>
-        </w:rPr>
-      </w:pPr>
-      <w:r>
-        <w:rPr>
-          <w:b/>
-          <w:bCs/>
-          <w:sz w:val="40"/>
-          <w:szCs w:val="40"/>
+        <w:ind w:left="720" w:hanging="720"/>
+        <w:rPr>
+          <w:b/>
+          <w:bCs/>
+          <w:sz w:val="24"/>
+          <w:szCs w:val="24"/>
+          <w:lang w:val="es-AR"/>
+        </w:rPr>
+      </w:pPr>
+      <w:r>
+        <w:rPr>
+          <w:b/>
+          <w:bCs/>
+          <w:sz w:val="24"/>
+          <w:szCs w:val="24"/>
+          <w:lang w:val="es-AR"/>
+        </w:rPr>
+        <w:t xml:space="preserve">Alumno: </w:t>
+      </w:r>
+      <w:proofErr w:type="spellStart"/>
+      <w:r>
+        <w:rPr>
+          <w:b/>
+          <w:bCs/>
+          <w:sz w:val="24"/>
+          <w:szCs w:val="24"/>
+          <w:lang w:val="es-AR"/>
+        </w:rPr>
+        <w:t>Oberto</w:t>
+      </w:r>
+      <w:proofErr w:type="spellEnd"/>
+      <w:r>
+        <w:rPr>
+          <w:b/>
+          <w:bCs/>
+          <w:sz w:val="24"/>
+          <w:szCs w:val="24"/>
+          <w:lang w:val="es-AR"/>
+        </w:rPr>
+        <w:t xml:space="preserve"> Martin Federico</w:t>
+      </w:r>
+    </w:p>
+    <w:p>
+      <w:pPr>
+        <w:rPr>
+          <w:b/>
+          <w:bCs/>
+          <w:sz w:val="24"/>
+          <w:szCs w:val="24"/>
+          <w:lang w:val="es-AR"/>
+        </w:rPr>
+      </w:pPr>
+      <w:r>
+        <w:rPr>
+          <w:b/>
+          <w:bCs/>
+          <w:noProof/>
+          <w:sz w:val="24"/>
+          <w:szCs w:val="24"/>
           <w:lang w:val="es-AR"/>
         </w:rPr>
         <w:drawing>
-          <wp:inline distT="0" distB="0" distL="0" distR="0" wp14:anchorId="1F1D439D" wp14:editId="73D867FC">
-            <wp:extent cx="5612130" cy="636270"/>
+          <wp:inline distT="0" distB="0" distL="0" distR="0" wp14:anchorId="5F62153D" wp14:editId="41039C51">
+            <wp:extent cx="5612130" cy="1562735"/>
             <wp:effectExtent l="0" t="0" r="7620" b="0"/>
-            <wp:docPr id="1" name="Imagen 1"/>
+            <wp:docPr id="6" name="Imagen 6"/>
             <wp:cNvGraphicFramePr>
               <a:graphicFrameLocks xmlns:a="http://schemas.openxmlformats.org/drawingml/2006/main" noChangeAspect="1"/>
             </wp:cNvGraphicFramePr>
@@ -88,7 +111,7 @@
                   <pic:spPr>
                     <a:xfrm>
                       <a:off x="0" y="0"/>
-                      <a:ext cx="5612130" cy="636270"/>
+                      <a:ext cx="5612130" cy="1562735"/>
                     </a:xfrm>
                     <a:prstGeom prst="rect">
                       <a:avLst/>
@@ -119,96 +142,34 @@
           <w:szCs w:val="24"/>
           <w:lang w:val="es-AR"/>
         </w:rPr>
-        <w:t xml:space="preserve">Alumno: </w:t>
-      </w:r>
-      <w:proofErr w:type="spellStart"/>
-      <w:r>
-        <w:rPr>
-          <w:b/>
-          <w:bCs/>
-          <w:sz w:val="24"/>
-          <w:szCs w:val="24"/>
-          <w:lang w:val="es-AR"/>
-        </w:rPr>
-        <w:t>Musumano</w:t>
-      </w:r>
-      <w:proofErr w:type="spellEnd"/>
-      <w:r>
-        <w:rPr>
-          <w:b/>
-          <w:bCs/>
-          <w:sz w:val="24"/>
-          <w:szCs w:val="24"/>
-          <w:lang w:val="es-AR"/>
-        </w:rPr>
-        <w:t xml:space="preserve"> Ignacio</w:t>
-      </w:r>
-    </w:p>
-    <w:p>
-      <w:pPr>
-        <w:rPr>
-          <w:b/>
-          <w:bCs/>
-          <w:sz w:val="24"/>
-          <w:szCs w:val="24"/>
-          <w:lang w:val="es-AR"/>
-        </w:rPr>
-      </w:pPr>
-    </w:p>
-    <w:p>
-      <w:pPr>
-        <w:rPr>
-          <w:b/>
-          <w:bCs/>
-          <w:sz w:val="24"/>
-          <w:szCs w:val="24"/>
-          <w:lang w:val="es-AR"/>
-        </w:rPr>
-      </w:pPr>
-      <w:r>
-        <w:rPr>
-          <w:b/>
-          <w:bCs/>
-          <w:sz w:val="24"/>
-          <w:szCs w:val="24"/>
-          <w:lang w:val="es-AR"/>
-        </w:rPr>
-        <w:t xml:space="preserve">Alumno: </w:t>
-      </w:r>
-      <w:r>
-        <w:rPr>
-          <w:b/>
-          <w:bCs/>
-          <w:sz w:val="24"/>
-          <w:szCs w:val="24"/>
-          <w:lang w:val="es-AR"/>
-        </w:rPr>
-        <w:t>Verra José Ignacio</w:t>
-      </w:r>
-    </w:p>
-    <w:p>
-      <w:pPr>
-        <w:rPr>
-          <w:b/>
-          <w:bCs/>
-          <w:sz w:val="24"/>
-          <w:szCs w:val="24"/>
-          <w:lang w:val="es-AR"/>
-        </w:rPr>
-      </w:pPr>
-      <w:r>
-        <w:rPr>
-          <w:b/>
-          <w:bCs/>
-          <w:sz w:val="24"/>
-          <w:szCs w:val="24"/>
+        <w:t>Alumno: Cerino Gonzalo</w:t>
+      </w:r>
+    </w:p>
+    <w:p>
+      <w:pPr>
+        <w:jc w:val="center"/>
+        <w:rPr>
+          <w:b/>
+          <w:bCs/>
+          <w:sz w:val="40"/>
+          <w:szCs w:val="40"/>
+          <w:lang w:val="es-AR"/>
+        </w:rPr>
+      </w:pPr>
+      <w:r>
+        <w:rPr>
+          <w:b/>
+          <w:bCs/>
+          <w:noProof/>
+          <w:sz w:val="40"/>
+          <w:szCs w:val="40"/>
           <w:lang w:val="es-AR"/>
         </w:rPr>
         <w:drawing>
-          <wp:inline distT="0" distB="0" distL="0" distR="0" wp14:anchorId="3C21BE83" wp14:editId="4044CD41">
-            <wp:extent cx="5612130" cy="844550"/>
+          <wp:inline distT="0" distB="0" distL="0" distR="0" wp14:anchorId="1F1D439D" wp14:editId="73D867FC">
+            <wp:extent cx="5612130" cy="636270"/>
             <wp:effectExtent l="0" t="0" r="7620" b="0"/>
-            <wp:docPr id="2" name="Imagen 2"/>
+            <wp:docPr id="1" name="Imagen 1"/>
             <wp:cNvGraphicFramePr>
               <a:graphicFrameLocks xmlns:a="http://schemas.openxmlformats.org/drawingml/2006/main" noChangeAspect="1"/>
             </wp:cNvGraphicFramePr>
@@ -228,7 +189,7 @@
                   <pic:spPr>
                     <a:xfrm>
                       <a:off x="0" y="0"/>
-                      <a:ext cx="5612130" cy="844550"/>
+                      <a:ext cx="5612130" cy="636270"/>
                     </a:xfrm>
                     <a:prstGeom prst="rect">
                       <a:avLst/>
@@ -261,15 +222,27 @@
         </w:rPr>
         <w:t xml:space="preserve">Alumno: </w:t>
       </w:r>
-      <w:r>
-        <w:rPr>
-          <w:b/>
-          <w:bCs/>
-          <w:sz w:val="24"/>
-          <w:szCs w:val="24"/>
-          <w:lang w:val="es-AR"/>
-        </w:rPr>
-        <w:t xml:space="preserve">Torres Martínez Jeremías </w:t>
+      <w:proofErr w:type="spellStart"/>
+      <w:r>
+        <w:rPr>
+          <w:b/>
+          <w:bCs/>
+          <w:sz w:val="24"/>
+          <w:szCs w:val="24"/>
+          <w:lang w:val="es-AR"/>
+        </w:rPr>
+        <w:t>Musumano</w:t>
+      </w:r>
+      <w:proofErr w:type="spellEnd"/>
+      <w:r>
+        <w:rPr>
+          <w:b/>
+          <w:bCs/>
+          <w:sz w:val="24"/>
+          <w:szCs w:val="24"/>
+          <w:lang w:val="es-AR"/>
+        </w:rPr>
+        <w:t xml:space="preserve"> Ignacio</w:t>
       </w:r>
     </w:p>
     <w:p>
@@ -291,10 +264,10 @@
           <w:lang w:val="es-AR"/>
         </w:rPr>
         <w:drawing>
-          <wp:inline distT="0" distB="0" distL="0" distR="0" wp14:anchorId="6BB87EDD" wp14:editId="3B02E44D">
-            <wp:extent cx="5612130" cy="857885"/>
+          <wp:inline distT="0" distB="0" distL="0" distR="0" wp14:anchorId="19A7A30C" wp14:editId="616A2CDB">
+            <wp:extent cx="5612130" cy="724535"/>
             <wp:effectExtent l="0" t="0" r="7620" b="0"/>
-            <wp:docPr id="3" name="Imagen 3"/>
+            <wp:docPr id="8" name="Imagen 8"/>
             <wp:cNvGraphicFramePr>
               <a:graphicFrameLocks xmlns:a="http://schemas.openxmlformats.org/drawingml/2006/main" noChangeAspect="1"/>
             </wp:cNvGraphicFramePr>
@@ -314,7 +287,7 @@
                   <pic:spPr>
                     <a:xfrm>
                       <a:off x="0" y="0"/>
-                      <a:ext cx="5612130" cy="857885"/>
+                      <a:ext cx="5612130" cy="724535"/>
                     </a:xfrm>
                     <a:prstGeom prst="rect">
                       <a:avLst/>
@@ -347,52 +320,41 @@
         </w:rPr>
         <w:t xml:space="preserve">Alumno: </w:t>
       </w:r>
-      <w:proofErr w:type="spellStart"/>
-      <w:r>
-        <w:rPr>
-          <w:b/>
-          <w:bCs/>
-          <w:sz w:val="24"/>
-          <w:szCs w:val="24"/>
-          <w:lang w:val="es-AR"/>
-        </w:rPr>
-        <w:t>Fornes</w:t>
-      </w:r>
-      <w:proofErr w:type="spellEnd"/>
-      <w:r>
-        <w:rPr>
-          <w:b/>
-          <w:bCs/>
-          <w:sz w:val="24"/>
-          <w:szCs w:val="24"/>
-          <w:lang w:val="es-AR"/>
-        </w:rPr>
-        <w:t xml:space="preserve"> Leandro</w:t>
-      </w:r>
-    </w:p>
-    <w:p>
-      <w:pPr>
-        <w:rPr>
-          <w:b/>
-          <w:bCs/>
-          <w:sz w:val="24"/>
-          <w:szCs w:val="24"/>
-          <w:lang w:val="es-AR"/>
-        </w:rPr>
-      </w:pPr>
-      <w:r>
-        <w:rPr>
-          <w:b/>
-          <w:bCs/>
+      <w:r>
+        <w:rPr>
+          <w:b/>
+          <w:bCs/>
+          <w:sz w:val="24"/>
+          <w:szCs w:val="24"/>
+          <w:lang w:val="es-AR"/>
+        </w:rPr>
+        <w:t>Verra José Ignacio</w:t>
+      </w:r>
+    </w:p>
+    <w:p>
+      <w:pPr>
+        <w:rPr>
+          <w:b/>
+          <w:bCs/>
+          <w:sz w:val="24"/>
+          <w:szCs w:val="24"/>
+          <w:lang w:val="es-AR"/>
+        </w:rPr>
+      </w:pPr>
+      <w:r>
+        <w:rPr>
+          <w:b/>
+          <w:bCs/>
+          <w:noProof/>
           <w:sz w:val="24"/>
           <w:szCs w:val="24"/>
           <w:lang w:val="es-AR"/>
         </w:rPr>
         <w:drawing>
-          <wp:inline distT="0" distB="0" distL="0" distR="0" wp14:anchorId="353925CB" wp14:editId="1FF1A492">
-            <wp:extent cx="5612130" cy="828675"/>
-            <wp:effectExtent l="0" t="0" r="7620" b="9525"/>
-            <wp:docPr id="4" name="Imagen 4"/>
+          <wp:inline distT="0" distB="0" distL="0" distR="0" wp14:anchorId="3C21BE83" wp14:editId="4044CD41">
+            <wp:extent cx="5612130" cy="844550"/>
+            <wp:effectExtent l="0" t="0" r="7620" b="0"/>
+            <wp:docPr id="2" name="Imagen 2"/>
             <wp:cNvGraphicFramePr>
               <a:graphicFrameLocks xmlns:a="http://schemas.openxmlformats.org/drawingml/2006/main" noChangeAspect="1"/>
             </wp:cNvGraphicFramePr>
@@ -412,6 +374,313 @@
                   <pic:spPr>
                     <a:xfrm>
                       <a:off x="0" y="0"/>
+                      <a:ext cx="5612130" cy="844550"/>
+                    </a:xfrm>
+                    <a:prstGeom prst="rect">
+                      <a:avLst/>
+                    </a:prstGeom>
+                  </pic:spPr>
+                </pic:pic>
+              </a:graphicData>
+            </a:graphic>
+          </wp:inline>
+        </w:drawing>
+      </w:r>
+    </w:p>
+    <w:p>
+      <w:pPr>
+        <w:rPr>
+          <w:b/>
+          <w:bCs/>
+          <w:sz w:val="24"/>
+          <w:szCs w:val="24"/>
+          <w:lang w:val="es-AR"/>
+        </w:rPr>
+      </w:pPr>
+      <w:r>
+        <w:rPr>
+          <w:b/>
+          <w:bCs/>
+          <w:sz w:val="24"/>
+          <w:szCs w:val="24"/>
+          <w:lang w:val="es-AR"/>
+        </w:rPr>
+        <w:t xml:space="preserve">Alumno: </w:t>
+      </w:r>
+      <w:r>
+        <w:rPr>
+          <w:b/>
+          <w:bCs/>
+          <w:sz w:val="24"/>
+          <w:szCs w:val="24"/>
+          <w:lang w:val="es-AR"/>
+        </w:rPr>
+        <w:t>Rubilar Ivo Valentin</w:t>
+      </w:r>
+    </w:p>
+    <w:p>
+      <w:pPr>
+        <w:rPr>
+          <w:b/>
+          <w:bCs/>
+          <w:sz w:val="24"/>
+          <w:szCs w:val="24"/>
+          <w:lang w:val="es-AR"/>
+        </w:rPr>
+      </w:pPr>
+      <w:r>
+        <w:rPr>
+          <w:b/>
+          <w:bCs/>
+          <w:noProof/>
+          <w:sz w:val="24"/>
+          <w:szCs w:val="24"/>
+          <w:lang w:val="es-AR"/>
+        </w:rPr>
+        <w:drawing>
+          <wp:inline distT="0" distB="0" distL="0" distR="0" wp14:anchorId="0ABDAC67" wp14:editId="314061D6">
+            <wp:extent cx="5612130" cy="875030"/>
+            <wp:effectExtent l="0" t="0" r="7620" b="1270"/>
+            <wp:docPr id="7" name="Imagen 7"/>
+            <wp:cNvGraphicFramePr>
+              <a:graphicFrameLocks xmlns:a="http://schemas.openxmlformats.org/drawingml/2006/main" noChangeAspect="1"/>
+            </wp:cNvGraphicFramePr>
+            <a:graphic xmlns:a="http://schemas.openxmlformats.org/drawingml/2006/main">
+              <a:graphicData uri="http://schemas.openxmlformats.org/drawingml/2006/picture">
+                <pic:pic xmlns:pic="http://schemas.openxmlformats.org/drawingml/2006/picture">
+                  <pic:nvPicPr>
+                    <pic:cNvPr id="1" name=""/>
+                    <pic:cNvPicPr/>
+                  </pic:nvPicPr>
+                  <pic:blipFill>
+                    <a:blip r:embed="rId8"/>
+                    <a:stretch>
+                      <a:fillRect/>
+                    </a:stretch>
+                  </pic:blipFill>
+                  <pic:spPr>
+                    <a:xfrm>
+                      <a:off x="0" y="0"/>
+                      <a:ext cx="5612130" cy="875030"/>
+                    </a:xfrm>
+                    <a:prstGeom prst="rect">
+                      <a:avLst/>
+                    </a:prstGeom>
+                  </pic:spPr>
+                </pic:pic>
+              </a:graphicData>
+            </a:graphic>
+          </wp:inline>
+        </w:drawing>
+      </w:r>
+    </w:p>
+    <w:p>
+      <w:pPr>
+        <w:rPr>
+          <w:b/>
+          <w:bCs/>
+          <w:sz w:val="24"/>
+          <w:szCs w:val="24"/>
+          <w:lang w:val="es-AR"/>
+        </w:rPr>
+      </w:pPr>
+    </w:p>
+    <w:p>
+      <w:pPr>
+        <w:rPr>
+          <w:b/>
+          <w:bCs/>
+          <w:sz w:val="24"/>
+          <w:szCs w:val="24"/>
+          <w:lang w:val="es-AR"/>
+        </w:rPr>
+      </w:pPr>
+    </w:p>
+    <w:p>
+      <w:pPr>
+        <w:rPr>
+          <w:b/>
+          <w:bCs/>
+          <w:sz w:val="24"/>
+          <w:szCs w:val="24"/>
+          <w:lang w:val="es-AR"/>
+        </w:rPr>
+      </w:pPr>
+    </w:p>
+    <w:p>
+      <w:pPr>
+        <w:rPr>
+          <w:b/>
+          <w:bCs/>
+          <w:sz w:val="24"/>
+          <w:szCs w:val="24"/>
+          <w:lang w:val="es-AR"/>
+        </w:rPr>
+      </w:pPr>
+      <w:r>
+        <w:rPr>
+          <w:b/>
+          <w:bCs/>
+          <w:sz w:val="24"/>
+          <w:szCs w:val="24"/>
+          <w:lang w:val="es-AR"/>
+        </w:rPr>
+        <w:lastRenderedPageBreak/>
+        <w:t xml:space="preserve">Alumno: </w:t>
+      </w:r>
+      <w:r>
+        <w:rPr>
+          <w:b/>
+          <w:bCs/>
+          <w:sz w:val="24"/>
+          <w:szCs w:val="24"/>
+          <w:lang w:val="es-AR"/>
+        </w:rPr>
+        <w:t xml:space="preserve">Torres Martínez Jeremías </w:t>
+      </w:r>
+    </w:p>
+    <w:p>
+      <w:pPr>
+        <w:rPr>
+          <w:b/>
+          <w:bCs/>
+          <w:sz w:val="24"/>
+          <w:szCs w:val="24"/>
+          <w:lang w:val="es-AR"/>
+        </w:rPr>
+      </w:pPr>
+      <w:r>
+        <w:rPr>
+          <w:b/>
+          <w:bCs/>
+          <w:noProof/>
+          <w:sz w:val="24"/>
+          <w:szCs w:val="24"/>
+          <w:lang w:val="es-AR"/>
+        </w:rPr>
+        <w:drawing>
+          <wp:inline distT="0" distB="0" distL="0" distR="0" wp14:anchorId="6BB87EDD" wp14:editId="3B02E44D">
+            <wp:extent cx="5612130" cy="857885"/>
+            <wp:effectExtent l="0" t="0" r="7620" b="0"/>
+            <wp:docPr id="3" name="Imagen 3"/>
+            <wp:cNvGraphicFramePr>
+              <a:graphicFrameLocks xmlns:a="http://schemas.openxmlformats.org/drawingml/2006/main" noChangeAspect="1"/>
+            </wp:cNvGraphicFramePr>
+            <a:graphic xmlns:a="http://schemas.openxmlformats.org/drawingml/2006/main">
+              <a:graphicData uri="http://schemas.openxmlformats.org/drawingml/2006/picture">
+                <pic:pic xmlns:pic="http://schemas.openxmlformats.org/drawingml/2006/picture">
+                  <pic:nvPicPr>
+                    <pic:cNvPr id="1" name=""/>
+                    <pic:cNvPicPr/>
+                  </pic:nvPicPr>
+                  <pic:blipFill>
+                    <a:blip r:embed="rId9"/>
+                    <a:stretch>
+                      <a:fillRect/>
+                    </a:stretch>
+                  </pic:blipFill>
+                  <pic:spPr>
+                    <a:xfrm>
+                      <a:off x="0" y="0"/>
+                      <a:ext cx="5612130" cy="857885"/>
+                    </a:xfrm>
+                    <a:prstGeom prst="rect">
+                      <a:avLst/>
+                    </a:prstGeom>
+                  </pic:spPr>
+                </pic:pic>
+              </a:graphicData>
+            </a:graphic>
+          </wp:inline>
+        </w:drawing>
+      </w:r>
+    </w:p>
+    <w:p>
+      <w:pPr>
+        <w:rPr>
+          <w:b/>
+          <w:bCs/>
+          <w:sz w:val="24"/>
+          <w:szCs w:val="24"/>
+          <w:lang w:val="es-AR"/>
+        </w:rPr>
+      </w:pPr>
+      <w:r>
+        <w:rPr>
+          <w:b/>
+          <w:bCs/>
+          <w:sz w:val="24"/>
+          <w:szCs w:val="24"/>
+          <w:lang w:val="es-AR"/>
+        </w:rPr>
+        <w:t xml:space="preserve">Alumno: </w:t>
+      </w:r>
+      <w:proofErr w:type="spellStart"/>
+      <w:r>
+        <w:rPr>
+          <w:b/>
+          <w:bCs/>
+          <w:sz w:val="24"/>
+          <w:szCs w:val="24"/>
+          <w:lang w:val="es-AR"/>
+        </w:rPr>
+        <w:t>Fornes</w:t>
+      </w:r>
+      <w:proofErr w:type="spellEnd"/>
+      <w:r>
+        <w:rPr>
+          <w:b/>
+          <w:bCs/>
+          <w:sz w:val="24"/>
+          <w:szCs w:val="24"/>
+          <w:lang w:val="es-AR"/>
+        </w:rPr>
+        <w:t xml:space="preserve"> Leandro</w:t>
+      </w:r>
+    </w:p>
+    <w:p>
+      <w:pPr>
+        <w:rPr>
+          <w:b/>
+          <w:bCs/>
+          <w:sz w:val="24"/>
+          <w:szCs w:val="24"/>
+          <w:lang w:val="es-AR"/>
+        </w:rPr>
+      </w:pPr>
+      <w:r>
+        <w:rPr>
+          <w:b/>
+          <w:bCs/>
+          <w:noProof/>
+          <w:sz w:val="24"/>
+          <w:szCs w:val="24"/>
+          <w:lang w:val="es-AR"/>
+        </w:rPr>
+        <w:drawing>
+          <wp:inline distT="0" distB="0" distL="0" distR="0" wp14:anchorId="353925CB" wp14:editId="1FF1A492">
+            <wp:extent cx="5612130" cy="828675"/>
+            <wp:effectExtent l="0" t="0" r="7620" b="9525"/>
+            <wp:docPr id="4" name="Imagen 4"/>
+            <wp:cNvGraphicFramePr>
+              <a:graphicFrameLocks xmlns:a="http://schemas.openxmlformats.org/drawingml/2006/main" noChangeAspect="1"/>
+            </wp:cNvGraphicFramePr>
+            <a:graphic xmlns:a="http://schemas.openxmlformats.org/drawingml/2006/main">
+              <a:graphicData uri="http://schemas.openxmlformats.org/drawingml/2006/picture">
+                <pic:pic xmlns:pic="http://schemas.openxmlformats.org/drawingml/2006/picture">
+                  <pic:nvPicPr>
+                    <pic:cNvPr id="1" name=""/>
+                    <pic:cNvPicPr/>
+                  </pic:nvPicPr>
+                  <pic:blipFill>
+                    <a:blip r:embed="rId10"/>
+                    <a:stretch>
+                      <a:fillRect/>
+                    </a:stretch>
+                  </pic:blipFill>
+                  <pic:spPr>
+                    <a:xfrm>
+                      <a:off x="0" y="0"/>
                       <a:ext cx="5612130" cy="828675"/>
                     </a:xfrm>
                     <a:prstGeom prst="rect">
@@ -453,40 +722,64 @@
           <w:szCs w:val="24"/>
           <w:lang w:val="es-AR"/>
         </w:rPr>
-        <w:t>Ahumada Valentin Maximiliano</w:t>
-      </w:r>
-      <w:r>
-        <w:rPr>
-          <w:b/>
-          <w:bCs/>
-          <w:sz w:val="24"/>
-          <w:szCs w:val="24"/>
-          <w:lang w:val="es-AR"/>
-        </w:rPr>
-        <w:t xml:space="preserve"> </w:t>
-      </w:r>
-    </w:p>
-    <w:p>
-      <w:pPr>
-        <w:rPr>
-          <w:b/>
-          <w:bCs/>
-          <w:sz w:val="24"/>
-          <w:szCs w:val="24"/>
-          <w:lang w:val="es-AR"/>
-        </w:rPr>
-      </w:pPr>
-    </w:p>
-    <w:p>
-      <w:pPr>
-        <w:rPr>
-          <w:b/>
-          <w:bCs/>
-          <w:sz w:val="24"/>
-          <w:szCs w:val="24"/>
-          <w:lang w:val="es-AR"/>
-        </w:rPr>
-      </w:pPr>
+        <w:t xml:space="preserve">Ahumada Valentin Maximiliano </w:t>
+      </w:r>
+    </w:p>
+    <w:p>
+      <w:pPr>
+        <w:rPr>
+          <w:b/>
+          <w:bCs/>
+          <w:sz w:val="24"/>
+          <w:szCs w:val="24"/>
+          <w:lang w:val="es-AR"/>
+        </w:rPr>
+      </w:pPr>
+      <w:r>
+        <w:rPr>
+          <w:b/>
+          <w:bCs/>
+          <w:noProof/>
+          <w:sz w:val="24"/>
+          <w:szCs w:val="24"/>
+          <w:lang w:val="es-AR"/>
+        </w:rPr>
+        <w:drawing>
+          <wp:inline distT="0" distB="0" distL="0" distR="0" wp14:anchorId="419AC6A3" wp14:editId="062C9FDE">
+            <wp:extent cx="5612130" cy="1522095"/>
+            <wp:effectExtent l="0" t="0" r="7620" b="1905"/>
+            <wp:docPr id="5" name="Imagen 5"/>
+            <wp:cNvGraphicFramePr>
+              <a:graphicFrameLocks xmlns:a="http://schemas.openxmlformats.org/drawingml/2006/main" noChangeAspect="1"/>
+            </wp:cNvGraphicFramePr>
+            <a:graphic xmlns:a="http://schemas.openxmlformats.org/drawingml/2006/main">
+              <a:graphicData uri="http://schemas.openxmlformats.org/drawingml/2006/picture">
+                <pic:pic xmlns:pic="http://schemas.openxmlformats.org/drawingml/2006/picture">
+                  <pic:nvPicPr>
+                    <pic:cNvPr id="1" name=""/>
+                    <pic:cNvPicPr/>
+                  </pic:nvPicPr>
+                  <pic:blipFill>
+                    <a:blip r:embed="rId11"/>
+                    <a:stretch>
+                      <a:fillRect/>
+                    </a:stretch>
+                  </pic:blipFill>
+                  <pic:spPr>
+                    <a:xfrm>
+                      <a:off x="0" y="0"/>
+                      <a:ext cx="5612130" cy="1522095"/>
+                    </a:xfrm>
+                    <a:prstGeom prst="rect">
+                      <a:avLst/>
+                    </a:prstGeom>
+                  </pic:spPr>
+                </pic:pic>
+              </a:graphicData>
+            </a:graphic>
+          </wp:inline>
+        </w:drawing>
+      </w:r>
     </w:p>
     <w:sectPr>
       <w:pgSz w:w="12240" w:h="15840"/>

</xml_diff>